<commit_message>
Render whole books through the pandoc request path
Add the whole-book request driver and scope dispatch, with chapter-
relative resources (part-page and caption images, margin bibliography).
render_pandoc_request takes scope, capturesByPath and onProgress, reports
stats.book and per-chapter diagnostics, and the resolver reports the book
and its chapters. Recordings were re-recorded after the TOC-title
template fix, and an opt-in Chromium spec measures whole-book renders.

Co-Authored-By: Claude Sonnet 5.5 <noreply@anthropic.com>
</commit_message>
<xml_diff>
--- a/crates/quarto-core/tests/fixtures/pandoc-recordings/recordings/callouts-docx/capture/callouts.docx
+++ b/crates/quarto-core/tests/fixtures/pandoc-recordings/recordings/callouts-docx/capture/callouts.docx
@@ -65,7 +65,7 @@
                     <a:graphicData uri="http://schemas.openxmlformats.org/drawingml/2006/picture">
                       <pic:pic>
                         <pic:nvPicPr>
-                          <pic:cNvPr descr="/var/folders/_5/l_f9_2dj4n5dpm0ztth7n97c0000gp/T/quarto-pipeline_6kkeZF/pandoc-share/formats/docx/warning.png" id="11" name="Picture"/>
+                          <pic:cNvPr descr="/var/folders/_5/l_f9_2dj4n5dpm0ztth7n97c0000gp/T/quarto-pipeline_2HPGBa/pandoc-share/formats/docx/warning.png" id="11" name="Picture"/>
                           <pic:cNvPicPr>
                             <a:picLocks noChangeArrowheads="1" noChangeAspect="1"/>
                           </pic:cNvPicPr>
@@ -189,7 +189,7 @@
                     <a:graphicData uri="http://schemas.openxmlformats.org/drawingml/2006/picture">
                       <pic:pic>
                         <pic:nvPicPr>
-                          <pic:cNvPr descr="/var/folders/_5/l_f9_2dj4n5dpm0ztth7n97c0000gp/T/quarto-pipeline_6kkeZF/pandoc-share/formats/docx/important.png" id="14" name="Picture"/>
+                          <pic:cNvPr descr="/var/folders/_5/l_f9_2dj4n5dpm0ztth7n97c0000gp/T/quarto-pipeline_2HPGBa/pandoc-share/formats/docx/important.png" id="14" name="Picture"/>
                           <pic:cNvPicPr>
                             <a:picLocks noChangeArrowheads="1" noChangeAspect="1"/>
                           </pic:cNvPicPr>
@@ -313,7 +313,7 @@
                     <a:graphicData uri="http://schemas.openxmlformats.org/drawingml/2006/picture">
                       <pic:pic>
                         <pic:nvPicPr>
-                          <pic:cNvPr descr="/var/folders/_5/l_f9_2dj4n5dpm0ztth7n97c0000gp/T/quarto-pipeline_6kkeZF/pandoc-share/formats/docx/note.png" id="17" name="Picture"/>
+                          <pic:cNvPr descr="/var/folders/_5/l_f9_2dj4n5dpm0ztth7n97c0000gp/T/quarto-pipeline_2HPGBa/pandoc-share/formats/docx/note.png" id="17" name="Picture"/>
                           <pic:cNvPicPr>
                             <a:picLocks noChangeArrowheads="1" noChangeAspect="1"/>
                           </pic:cNvPicPr>
@@ -497,7 +497,7 @@
                     <a:graphicData uri="http://schemas.openxmlformats.org/drawingml/2006/picture">
                       <pic:pic>
                         <pic:nvPicPr>
-                          <pic:cNvPr descr="/var/folders/_5/l_f9_2dj4n5dpm0ztth7n97c0000gp/T/quarto-pipeline_6kkeZF/pandoc-share/formats/docx/tip.png" id="20" name="Picture"/>
+                          <pic:cNvPr descr="/var/folders/_5/l_f9_2dj4n5dpm0ztth7n97c0000gp/T/quarto-pipeline_2HPGBa/pandoc-share/formats/docx/tip.png" id="20" name="Picture"/>
                           <pic:cNvPicPr>
                             <a:picLocks noChangeArrowheads="1" noChangeAspect="1"/>
                           </pic:cNvPicPr>
@@ -623,7 +623,7 @@
                     <a:graphicData uri="http://schemas.openxmlformats.org/drawingml/2006/picture">
                       <pic:pic>
                         <pic:nvPicPr>
-                          <pic:cNvPr descr="/var/folders/_5/l_f9_2dj4n5dpm0ztth7n97c0000gp/T/quarto-pipeline_6kkeZF/pandoc-share/formats/docx/tip.png" id="23" name="Picture"/>
+                          <pic:cNvPr descr="/var/folders/_5/l_f9_2dj4n5dpm0ztth7n97c0000gp/T/quarto-pipeline_2HPGBa/pandoc-share/formats/docx/tip.png" id="23" name="Picture"/>
                           <pic:cNvPicPr>
                             <a:picLocks noChangeArrowheads="1" noChangeAspect="1"/>
                           </pic:cNvPicPr>
@@ -772,7 +772,7 @@
                     <a:graphicData uri="http://schemas.openxmlformats.org/drawingml/2006/picture">
                       <pic:pic>
                         <pic:nvPicPr>
-                          <pic:cNvPr descr="/var/folders/_5/l_f9_2dj4n5dpm0ztth7n97c0000gp/T/quarto-pipeline_6kkeZF/pandoc-share/formats/docx/caution.png" id="26" name="Picture"/>
+                          <pic:cNvPr descr="/var/folders/_5/l_f9_2dj4n5dpm0ztth7n97c0000gp/T/quarto-pipeline_2HPGBa/pandoc-share/formats/docx/caution.png" id="26" name="Picture"/>
                           <pic:cNvPicPr>
                             <a:picLocks noChangeArrowheads="1" noChangeAspect="1"/>
                           </pic:cNvPicPr>
@@ -1017,7 +1017,7 @@
                     <a:graphicData uri="http://schemas.openxmlformats.org/drawingml/2006/picture">
                       <pic:pic>
                         <pic:nvPicPr>
-                          <pic:cNvPr descr="/var/folders/_5/l_f9_2dj4n5dpm0ztth7n97c0000gp/T/quarto-pipeline_6kkeZF/pandoc-share/formats/docx/caution.png" id="29" name="Picture"/>
+                          <pic:cNvPr descr="/var/folders/_5/l_f9_2dj4n5dpm0ztth7n97c0000gp/T/quarto-pipeline_2HPGBa/pandoc-share/formats/docx/caution.png" id="29" name="Picture"/>
                           <pic:cNvPicPr>
                             <a:picLocks noChangeArrowheads="1" noChangeAspect="1"/>
                           </pic:cNvPicPr>
@@ -1128,7 +1128,7 @@
                     <a:graphicData uri="http://schemas.openxmlformats.org/drawingml/2006/picture">
                       <pic:pic>
                         <pic:nvPicPr>
-                          <pic:cNvPr descr="/var/folders/_5/l_f9_2dj4n5dpm0ztth7n97c0000gp/T/quarto-pipeline_6kkeZF/pandoc-share/formats/docx/caution.png" id="31" name="Picture"/>
+                          <pic:cNvPr descr="/var/folders/_5/l_f9_2dj4n5dpm0ztth7n97c0000gp/T/quarto-pipeline_2HPGBa/pandoc-share/formats/docx/caution.png" id="31" name="Picture"/>
                           <pic:cNvPicPr>
                             <a:picLocks noChangeArrowheads="1" noChangeAspect="1"/>
                           </pic:cNvPicPr>

</xml_diff>